<commit_message>
refactor(theme): drop shipped presets, keep palette customisation
Presets baked one client's copy, images and categories into the app, which
does not carry to other projects. Each project now sets its own palette on
the Theme tab; Export/Import Theme remains the way to move a look between
sites or storefronts.

- Remove theme/presets/, list_presets and apply_preset.
- Remove the Apply Preset buttons, the Preset select on Webstore Settings
  and the Theme Preset field on Webstore (regenerated).
- Fresh installs no longer seed mona_flowers; they render the shipped
  defaults until configured.
- Tests import an inline palette instead of a preset, and clear the site's
  own storefront rows so their overrides do not bleed into assertions.
- README and customisation manual updated; guides rebuilt.
</commit_message>
<xml_diff>
--- a/docs/04-customisation-manual.docx
+++ b/docs/04-customisation-manual.docx
@@ -62,7 +62,7 @@
     </w:p>
     <w:p>
       <w:r>
-        <w:t>Everything else follows from that rule: you never have to fill in a whole palette to change one colour, and you can always return to a known-good state by emptying a field or applying a preset.</w:t>
+        <w:t>Everything else follows from that rule: you never have to fill in a whole palette to change one colour, and you can always return to a known-good state by emptying a field.</w:t>
       </w:r>
     </w:p>
     <w:p>
@@ -75,7 +75,7 @@
     </w:p>
     <w:p>
       <w:r>
-        <w:t>Start from a preset and adjust — it is far faster than filling in seventy fields by hand.</w:t>
+        <w:t>Start from the shipped defaults and set only what the client's brand needs — usually a few colours, the copy and the images.</w:t>
       </w:r>
     </w:p>
     <w:p>
@@ -83,15 +83,7 @@
         <w:pStyle w:val="ListNumber"/>
       </w:pPr>
       <w:r>
-        <w:t>Open Webstore Settings → Transfer. Choose a preset close to the client (upande for the stock gold look, mona_flowers for a navy single-product-line farm) and use Theme → Apply Preset.</w:t>
-      </w:r>
-    </w:p>
-    <w:p>
-      <w:pPr>
-        <w:pStyle w:val="ListNumber"/>
-      </w:pPr>
-      <w:r>
-        <w:t>Re-upload the images. Presets carry image links, not the files themselves; anything that did not come across is listed for you when the preset is applied. Upload the logo, favicon, hero photo and card images on the Branding tab.</w:t>
+        <w:t>Upload the logo, favicon, hero photo and card images on the Branding tab.</w:t>
       </w:r>
     </w:p>
     <w:p>
@@ -134,7 +126,7 @@
         <w:t xml:space="preserve">Installation behaviour: </w:t>
       </w:r>
       <w:r>
-        <w:t>A brand-new installation starts on the mona_flowers preset. Upgrading an existing site never changes its appearance — existing settings are left exactly as they are.</w:t>
+        <w:t>A brand-new installation starts on the shipped defaults, with no theme applied. Upgrading an existing site never changes its appearance — existing settings are left exactly as they are.</w:t>
       </w:r>
     </w:p>
     <w:p>
@@ -799,20 +791,6 @@
       </w:r>
     </w:p>
     <w:p>
-      <w:pPr>
-        <w:pStyle w:val="ListBullet"/>
-      </w:pPr>
-      <w:r>
-        <w:rPr>
-          <w:b/>
-        </w:rPr>
-        <w:t xml:space="preserve">Apply Preset — </w:t>
-      </w:r>
-      <w:r>
-        <w:t>choose from Preset and press. Same as an import, using a configuration that ships with the app.</w:t>
-      </w:r>
-    </w:p>
-    <w:p>
       <w:r>
         <w:rPr>
           <w:b/>
@@ -839,59 +817,7 @@
         <w:pStyle w:val="Heading1"/>
       </w:pPr>
       <w:r>
-        <w:t>7. The two shipped presets</w:t>
-      </w:r>
-    </w:p>
-    <w:p>
-      <w:r>
-        <w:t>Both are ordinary theme files, so they double as worked examples — apply one, look at what it filled in, and adjust from there.</w:t>
-      </w:r>
-    </w:p>
-    <w:p>
-      <w:pPr>
-        <w:pStyle w:val="ListBullet"/>
-      </w:pPr>
-      <w:r>
-        <w:rPr>
-          <w:b/>
-        </w:rPr>
-        <w:t xml:space="preserve">upande — </w:t>
-      </w:r>
-      <w:r>
-        <w:t>the stock Ink &amp; Gold design (accent #d9a514, ink #0a0a0a, canvas #f4f3ef) with black buttons and the Flowers / Coffee / Fresh Produce range. Use it to return a site to the shipped appearance, or to start a multi-category grower.</w:t>
-      </w:r>
-    </w:p>
-    <w:p>
-      <w:pPr>
-        <w:pStyle w:val="ListBullet"/>
-      </w:pPr>
-      <w:r>
-        <w:rPr>
-          <w:b/>
-        </w:rPr>
-        <w:t xml:space="preserve">mona_flowers — </w:t>
-      </w:r>
-      <w:r>
-        <w:t>navy on cool grey (accent #1e4d8c, ink #1a1a1a, canvas #f7f8fa) with navy buttons and navigation, a Roses and Eucalyptus range, and signup switched off. Use it to start a single-product-line farm with a non-black brand colour.</w:t>
-      </w:r>
-    </w:p>
-    <w:p>
-      <w:r>
-        <w:rPr>
-          <w:b/>
-        </w:rPr>
-        <w:t xml:space="preserve">Expected on import: </w:t>
-      </w:r>
-      <w:r>
-        <w:t>Mona's logo lives on Mona's own site, so applying that preset elsewhere reports the logo as missing. That is the importer doing its job — upload the client's own logo.</w:t>
-      </w:r>
-    </w:p>
-    <w:p>
-      <w:pPr>
-        <w:pStyle w:val="Heading1"/>
-      </w:pPr>
-      <w:r>
-        <w:t>8. Recipes</w:t>
+        <w:t>7. Recipes</w:t>
       </w:r>
     </w:p>
     <w:p>
@@ -969,7 +895,7 @@
         <w:pStyle w:val="Heading1"/>
       </w:pPr>
       <w:r>
-        <w:t>9. If something looks wrong</w:t>
+        <w:t>8. If something looks wrong</w:t>
       </w:r>
     </w:p>
     <w:p>
@@ -1025,7 +951,7 @@
         <w:t xml:space="preserve">My category cards or footer links vanished — </w:t>
       </w:r>
       <w:r>
-        <w:t>those come from tables, and an empty table hides its section. Add rows on the Branding tab, or apply a preset to get a working set you can edit.</w:t>
+        <w:t>those come from tables, and an empty table hides its section. Add rows on the Branding tab.</w:t>
       </w:r>
     </w:p>
     <w:p>
@@ -1081,7 +1007,7 @@
         <w:t xml:space="preserve">I want to start over — </w:t>
       </w:r>
       <w:r>
-        <w:t>apply the upande preset for the shipped appearance, or clear the Theme fields to send no overrides at all. Either way you are back to a known state without touching code.</w:t>
+        <w:t>clear the Theme fields to send no overrides at all, or import a theme file you exported earlier. Either way you are back to a known state without touching code.</w:t>
       </w:r>
     </w:p>
     <w:sectPr>

</xml_diff>